<commit_message>
fix(lab01): finalize report and presentation files
</commit_message>
<xml_diff>
--- a/labs/lab01/report/report.docx
+++ b/labs/lab01/report/report.docx
@@ -96,7 +96,7 @@
         </w:numPr>
       </w:pPr>
       <w:r>
-        <w:t xml:space="preserve">Установить на виртуальную машину дистрибутив ОС Linux (Rocky Linux 9).</w:t>
+        <w:t xml:space="preserve">Установить на виртуальную машину дистрибутив ОС Linux (Rocky Linux 10).</w:t>
       </w:r>
     </w:p>
     <w:p>
@@ -148,7 +148,7 @@
       </w:r>
     </w:p>
     <w:bookmarkEnd w:id="10"/>
-    <w:bookmarkStart w:id="30" w:name="выполнение-работы"/>
+    <w:bookmarkStart w:id="23" w:name="выполнение-работы"/>
     <w:p>
       <w:pPr>
         <w:pStyle w:val="Heading1"/>
@@ -157,7 +157,7 @@
         <w:t xml:space="preserve">3. Выполнение работы</w:t>
       </w:r>
     </w:p>
-    <w:bookmarkStart w:id="15" w:name="создание-виртуальной-машины"/>
+    <w:bookmarkStart w:id="14" w:name="создание-виртуальной-машины"/>
     <w:p>
       <w:pPr>
         <w:pStyle w:val="Heading2"/>
@@ -213,93 +213,69 @@
         <w:t xml:space="preserve">- Виртуальный жесткий диск: 40 ГБ</w:t>
       </w:r>
     </w:p>
-    <w:tbl>
-      <w:tblPr>
-        <w:tblStyle w:val="Table"/>
-        <w:tblW w:type="pct" w:w="5000"/>
-        <w:tblLayout w:type="fixed"/>
-        <w:tblLook w:firstRow="0" w:lastRow="0" w:firstColumn="0" w:lastColumn="0" w:noHBand="0" w:noVBand="0" w:val="0000"/>
-      </w:tblPr>
-      <w:tblGrid>
-        <w:gridCol w:w="7920"/>
-      </w:tblGrid>
-      <w:tr>
-        <w:tc>
-          <w:tcPr/>
-          <w:bookmarkStart w:id="14" w:name="fig-01-01"/>
-          <w:p>
-            <w:pPr>
-              <w:pStyle w:val="Compact"/>
-              <w:jc w:val="center"/>
-            </w:pPr>
-            <w:r>
-              <w:drawing>
-                <wp:inline>
-                  <wp:extent cx="4800600" cy="3732759"/>
-                  <wp:effectExtent b="0" l="0" r="0" t="0"/>
-                  <wp:docPr descr="" title="" id="12" name="Picture"/>
-                  <a:graphic>
-                    <a:graphicData uri="http://schemas.openxmlformats.org/drawingml/2006/picture">
-                      <pic:pic>
-                        <pic:nvPicPr>
-                          <pic:cNvPr descr="image/vm_settings.png" id="13" name="Picture"/>
-                          <pic:cNvPicPr>
-                            <a:picLocks noChangeArrowheads="1" noChangeAspect="1"/>
-                          </pic:cNvPicPr>
-                        </pic:nvPicPr>
-                        <pic:blipFill>
-                          <a:blip r:embed="rId11"/>
-                          <a:stretch>
-                            <a:fillRect/>
-                          </a:stretch>
-                        </pic:blipFill>
-                        <pic:spPr bwMode="auto">
-                          <a:xfrm>
-                            <a:off x="0" y="0"/>
-                            <a:ext cx="4800600" cy="3732759"/>
-                          </a:xfrm>
-                          <a:prstGeom prst="rect">
-                            <a:avLst/>
-                          </a:prstGeom>
-                          <a:noFill/>
-                          <a:ln w="9525">
-                            <a:noFill/>
-                            <a:headEnd/>
-                            <a:tailEnd/>
-                          </a:ln>
-                        </pic:spPr>
-                      </pic:pic>
-                    </a:graphicData>
-                  </a:graphic>
-                </wp:inline>
-              </w:drawing>
-            </w:r>
-          </w:p>
-          <w:p>
-            <w:pPr>
-              <w:jc w:val="center"/>
-            </w:pPr>
-            <w:pPr>
-              <w:jc w:val="left"/>
-              <w:spacing w:before="200"/>
-              <w:pStyle w:val="ImageCaption"/>
-            </w:pPr>
-            <w:r>
-              <w:t xml:space="preserve">Рисунок 1: Параметры виртуальной машины</w:t>
-            </w:r>
-          </w:p>
-          <w:bookmarkEnd w:id="14"/>
-        </w:tc>
-      </w:tr>
-    </w:tbl>
-    <w:bookmarkEnd w:id="15"/>
-    <w:bookmarkStart w:id="20" w:name="установка-rocky-linux-9"/>
+    <w:p>
+      <w:pPr>
+        <w:pStyle w:val="CaptionedFigure"/>
+      </w:pPr>
+      <w:r>
+        <w:drawing>
+          <wp:inline>
+            <wp:extent cx="5334000" cy="4147510"/>
+            <wp:effectExtent b="0" l="0" r="0" t="0"/>
+            <wp:docPr descr="Параметры ВМ" title="" id="12" name="Picture"/>
+            <a:graphic>
+              <a:graphicData uri="http://schemas.openxmlformats.org/drawingml/2006/picture">
+                <pic:pic>
+                  <pic:nvPicPr>
+                    <pic:cNvPr descr="image/1.png" id="13" name="Picture"/>
+                    <pic:cNvPicPr>
+                      <a:picLocks noChangeArrowheads="1" noChangeAspect="1"/>
+                    </pic:cNvPicPr>
+                  </pic:nvPicPr>
+                  <pic:blipFill>
+                    <a:blip r:embed="rId11"/>
+                    <a:stretch>
+                      <a:fillRect/>
+                    </a:stretch>
+                  </pic:blipFill>
+                  <pic:spPr bwMode="auto">
+                    <a:xfrm>
+                      <a:off x="0" y="0"/>
+                      <a:ext cx="5334000" cy="4147510"/>
+                    </a:xfrm>
+                    <a:prstGeom prst="rect">
+                      <a:avLst/>
+                    </a:prstGeom>
+                    <a:noFill/>
+                    <a:ln w="9525">
+                      <a:noFill/>
+                      <a:headEnd/>
+                      <a:tailEnd/>
+                    </a:ln>
+                  </pic:spPr>
+                </pic:pic>
+              </a:graphicData>
+            </a:graphic>
+          </wp:inline>
+        </w:drawing>
+      </w:r>
+    </w:p>
+    <w:p>
+      <w:pPr>
+        <w:pStyle w:val="ImageCaption"/>
+      </w:pPr>
+      <w:r>
+        <w:t xml:space="preserve">Параметры ВМ</w:t>
+      </w:r>
+    </w:p>
+    <w:bookmarkEnd w:id="14"/>
+    <w:bookmarkStart w:id="15" w:name="установка-rocky-linux-10"/>
     <w:p>
       <w:pPr>
         <w:pStyle w:val="Heading2"/>
       </w:pPr>
       <w:r>
-        <w:t xml:space="preserve">3.2 Установка Rocky Linux 9</w:t>
+        <w:t xml:space="preserve">3.2 Установка Rocky Linux 10</w:t>
       </w:r>
     </w:p>
     <w:p>
@@ -307,7 +283,7 @@
         <w:pStyle w:val="FirstParagraph"/>
       </w:pPr>
       <w:r>
-        <w:t xml:space="preserve">Установка производилась с использованием образа Rocky-9.4-x86_64-dvd.iso. В процессе установки были выполнены следующие настройки:</w:t>
+        <w:t xml:space="preserve">Установка производилась с использованием образа Rocky-10.2-x86_64-dvd1.iso. В процессе установки были выполнены следующие настройки:</w:t>
       </w:r>
       <w:r>
         <w:t xml:space="preserve"> </w:t>
@@ -370,87 +346,8 @@
         <w:t xml:space="preserve">с правами администратора</w:t>
       </w:r>
     </w:p>
-    <w:tbl>
-      <w:tblPr>
-        <w:tblStyle w:val="Table"/>
-        <w:tblW w:type="pct" w:w="5000"/>
-        <w:tblLayout w:type="fixed"/>
-        <w:tblLook w:firstRow="0" w:lastRow="0" w:firstColumn="0" w:lastColumn="0" w:noHBand="0" w:noVBand="0" w:val="0000"/>
-      </w:tblPr>
-      <w:tblGrid>
-        <w:gridCol w:w="7920"/>
-      </w:tblGrid>
-      <w:tr>
-        <w:tc>
-          <w:tcPr/>
-          <w:bookmarkStart w:id="19" w:name="fig-01-02"/>
-          <w:p>
-            <w:pPr>
-              <w:pStyle w:val="Compact"/>
-              <w:jc w:val="center"/>
-            </w:pPr>
-            <w:r>
-              <w:drawing>
-                <wp:inline>
-                  <wp:extent cx="4800600" cy="6746217"/>
-                  <wp:effectExtent b="0" l="0" r="0" t="0"/>
-                  <wp:docPr descr="" title="" id="17" name="Picture"/>
-                  <a:graphic>
-                    <a:graphicData uri="http://schemas.openxmlformats.org/drawingml/2006/picture">
-                      <pic:pic>
-                        <pic:nvPicPr>
-                          <pic:cNvPr descr="image/install_process.png" id="18" name="Picture"/>
-                          <pic:cNvPicPr>
-                            <a:picLocks noChangeArrowheads="1" noChangeAspect="1"/>
-                          </pic:cNvPicPr>
-                        </pic:nvPicPr>
-                        <pic:blipFill>
-                          <a:blip r:embed="rId16"/>
-                          <a:stretch>
-                            <a:fillRect/>
-                          </a:stretch>
-                        </pic:blipFill>
-                        <pic:spPr bwMode="auto">
-                          <a:xfrm>
-                            <a:off x="0" y="0"/>
-                            <a:ext cx="4800600" cy="6746217"/>
-                          </a:xfrm>
-                          <a:prstGeom prst="rect">
-                            <a:avLst/>
-                          </a:prstGeom>
-                          <a:noFill/>
-                          <a:ln w="9525">
-                            <a:noFill/>
-                            <a:headEnd/>
-                            <a:tailEnd/>
-                          </a:ln>
-                        </pic:spPr>
-                      </pic:pic>
-                    </a:graphicData>
-                  </a:graphic>
-                </wp:inline>
-              </w:drawing>
-            </w:r>
-          </w:p>
-          <w:p>
-            <w:pPr>
-              <w:jc w:val="center"/>
-            </w:pPr>
-            <w:pPr>
-              <w:jc w:val="left"/>
-              <w:spacing w:before="200"/>
-              <w:pStyle w:val="ImageCaption"/>
-            </w:pPr>
-            <w:r>
-              <w:t xml:space="preserve">Рисунок 2: Процесс установки ОС</w:t>
-            </w:r>
-          </w:p>
-          <w:bookmarkEnd w:id="19"/>
-        </w:tc>
-      </w:tr>
-    </w:tbl>
-    <w:bookmarkEnd w:id="20"/>
-    <w:bookmarkStart w:id="29" w:name="настройка-системы-и-анализ-загрузки"/>
+    <w:bookmarkEnd w:id="15"/>
+    <w:bookmarkStart w:id="22" w:name="настройка-системы-и-анализ-загрузки"/>
     <w:p>
       <w:pPr>
         <w:pStyle w:val="Heading2"/>
@@ -654,85 +551,61 @@
         <w:t xml:space="preserve">)</w:t>
       </w:r>
     </w:p>
-    <w:tbl>
-      <w:tblPr>
-        <w:tblStyle w:val="Table"/>
-        <w:tblW w:type="pct" w:w="5000"/>
-        <w:tblLayout w:type="fixed"/>
-        <w:tblLook w:firstRow="0" w:lastRow="0" w:firstColumn="0" w:lastColumn="0" w:noHBand="0" w:noVBand="0" w:val="0000"/>
-      </w:tblPr>
-      <w:tblGrid>
-        <w:gridCol w:w="7920"/>
-      </w:tblGrid>
-      <w:tr>
-        <w:tc>
-          <w:tcPr/>
-          <w:bookmarkStart w:id="24" w:name="fig-01-03"/>
-          <w:p>
-            <w:pPr>
-              <w:pStyle w:val="Compact"/>
-              <w:jc w:val="center"/>
-            </w:pPr>
-            <w:r>
-              <w:drawing>
-                <wp:inline>
-                  <wp:extent cx="4800600" cy="194507"/>
-                  <wp:effectExtent b="0" l="0" r="0" t="0"/>
-                  <wp:docPr descr="" title="" id="22" name="Picture"/>
-                  <a:graphic>
-                    <a:graphicData uri="http://schemas.openxmlformats.org/drawingml/2006/picture">
-                      <pic:pic>
-                        <pic:nvPicPr>
-                          <pic:cNvPr descr="image/dmesg.png" id="23" name="Picture"/>
-                          <pic:cNvPicPr>
-                            <a:picLocks noChangeArrowheads="1" noChangeAspect="1"/>
-                          </pic:cNvPicPr>
-                        </pic:nvPicPr>
-                        <pic:blipFill>
-                          <a:blip r:embed="rId21"/>
-                          <a:stretch>
-                            <a:fillRect/>
-                          </a:stretch>
-                        </pic:blipFill>
-                        <pic:spPr bwMode="auto">
-                          <a:xfrm>
-                            <a:off x="0" y="0"/>
-                            <a:ext cx="4800600" cy="194507"/>
-                          </a:xfrm>
-                          <a:prstGeom prst="rect">
-                            <a:avLst/>
-                          </a:prstGeom>
-                          <a:noFill/>
-                          <a:ln w="9525">
-                            <a:noFill/>
-                            <a:headEnd/>
-                            <a:tailEnd/>
-                          </a:ln>
-                        </pic:spPr>
-                      </pic:pic>
-                    </a:graphicData>
-                  </a:graphic>
-                </wp:inline>
-              </w:drawing>
-            </w:r>
-          </w:p>
-          <w:p>
-            <w:pPr>
-              <w:jc w:val="center"/>
-            </w:pPr>
-            <w:pPr>
-              <w:jc w:val="left"/>
-              <w:spacing w:before="200"/>
-              <w:pStyle w:val="ImageCaption"/>
-            </w:pPr>
-            <w:r>
-              <w:t xml:space="preserve">Рисунок 3: Анализ загрузки с помощью dmesg</w:t>
-            </w:r>
-          </w:p>
-          <w:bookmarkEnd w:id="24"/>
-        </w:tc>
-      </w:tr>
-    </w:tbl>
+    <w:p>
+      <w:pPr>
+        <w:pStyle w:val="CaptionedFigure"/>
+      </w:pPr>
+      <w:r>
+        <w:drawing>
+          <wp:inline>
+            <wp:extent cx="5334000" cy="216118"/>
+            <wp:effectExtent b="0" l="0" r="0" t="0"/>
+            <wp:docPr descr="Вывод dmesg" title="" id="17" name="Picture"/>
+            <a:graphic>
+              <a:graphicData uri="http://schemas.openxmlformats.org/drawingml/2006/picture">
+                <pic:pic>
+                  <pic:nvPicPr>
+                    <pic:cNvPr descr="image/2.png" id="18" name="Picture"/>
+                    <pic:cNvPicPr>
+                      <a:picLocks noChangeArrowheads="1" noChangeAspect="1"/>
+                    </pic:cNvPicPr>
+                  </pic:nvPicPr>
+                  <pic:blipFill>
+                    <a:blip r:embed="rId16"/>
+                    <a:stretch>
+                      <a:fillRect/>
+                    </a:stretch>
+                  </pic:blipFill>
+                  <pic:spPr bwMode="auto">
+                    <a:xfrm>
+                      <a:off x="0" y="0"/>
+                      <a:ext cx="5334000" cy="216118"/>
+                    </a:xfrm>
+                    <a:prstGeom prst="rect">
+                      <a:avLst/>
+                    </a:prstGeom>
+                    <a:noFill/>
+                    <a:ln w="9525">
+                      <a:noFill/>
+                      <a:headEnd/>
+                      <a:tailEnd/>
+                    </a:ln>
+                  </pic:spPr>
+                </pic:pic>
+              </a:graphicData>
+            </a:graphic>
+          </wp:inline>
+        </w:drawing>
+      </w:r>
+    </w:p>
+    <w:p>
+      <w:pPr>
+        <w:pStyle w:val="ImageCaption"/>
+      </w:pPr>
+      <w:r>
+        <w:t xml:space="preserve">Вывод dmesg</w:t>
+      </w:r>
+    </w:p>
     <w:p>
       <w:pPr>
         <w:pStyle w:val="BodyText"/>
@@ -753,88 +626,64 @@
         <w:t xml:space="preserve">.</w:t>
       </w:r>
     </w:p>
-    <w:tbl>
-      <w:tblPr>
-        <w:tblStyle w:val="Table"/>
-        <w:tblW w:type="pct" w:w="5000"/>
-        <w:tblLayout w:type="fixed"/>
-        <w:tblLook w:firstRow="0" w:lastRow="0" w:firstColumn="0" w:lastColumn="0" w:noHBand="0" w:noVBand="0" w:val="0000"/>
-      </w:tblPr>
-      <w:tblGrid>
-        <w:gridCol w:w="7920"/>
-      </w:tblGrid>
-      <w:tr>
-        <w:tc>
-          <w:tcPr/>
-          <w:bookmarkStart w:id="28" w:name="fig-01-04"/>
-          <w:p>
-            <w:pPr>
-              <w:pStyle w:val="Compact"/>
-              <w:jc w:val="center"/>
-            </w:pPr>
-            <w:r>
-              <w:drawing>
-                <wp:inline>
-                  <wp:extent cx="4800600" cy="1629949"/>
-                  <wp:effectExtent b="0" l="0" r="0" t="0"/>
-                  <wp:docPr descr="" title="" id="26" name="Picture"/>
-                  <a:graphic>
-                    <a:graphicData uri="http://schemas.openxmlformats.org/drawingml/2006/picture">
-                      <pic:pic>
-                        <pic:nvPicPr>
-                          <pic:cNvPr descr="image/mount.png" id="27" name="Picture"/>
-                          <pic:cNvPicPr>
-                            <a:picLocks noChangeArrowheads="1" noChangeAspect="1"/>
-                          </pic:cNvPicPr>
-                        </pic:nvPicPr>
-                        <pic:blipFill>
-                          <a:blip r:embed="rId25"/>
-                          <a:stretch>
-                            <a:fillRect/>
-                          </a:stretch>
-                        </pic:blipFill>
-                        <pic:spPr bwMode="auto">
-                          <a:xfrm>
-                            <a:off x="0" y="0"/>
-                            <a:ext cx="4800600" cy="1629949"/>
-                          </a:xfrm>
-                          <a:prstGeom prst="rect">
-                            <a:avLst/>
-                          </a:prstGeom>
-                          <a:noFill/>
-                          <a:ln w="9525">
-                            <a:noFill/>
-                            <a:headEnd/>
-                            <a:tailEnd/>
-                          </a:ln>
-                        </pic:spPr>
-                      </pic:pic>
-                    </a:graphicData>
-                  </a:graphic>
-                </wp:inline>
-              </w:drawing>
-            </w:r>
-          </w:p>
-          <w:p>
-            <w:pPr>
-              <w:jc w:val="center"/>
-            </w:pPr>
-            <w:pPr>
-              <w:jc w:val="left"/>
-              <w:spacing w:before="200"/>
-              <w:pStyle w:val="ImageCaption"/>
-            </w:pPr>
-            <w:r>
-              <w:t xml:space="preserve">Рисунок 4: Вывод команды mount</w:t>
-            </w:r>
-          </w:p>
-          <w:bookmarkEnd w:id="28"/>
-        </w:tc>
-      </w:tr>
-    </w:tbl>
-    <w:bookmarkEnd w:id="29"/>
-    <w:bookmarkEnd w:id="30"/>
-    <w:bookmarkStart w:id="31" w:name="выводы"/>
+    <w:p>
+      <w:pPr>
+        <w:pStyle w:val="CaptionedFigure"/>
+      </w:pPr>
+      <w:r>
+        <w:drawing>
+          <wp:inline>
+            <wp:extent cx="5334000" cy="1811054"/>
+            <wp:effectExtent b="0" l="0" r="0" t="0"/>
+            <wp:docPr descr="Вывод mount" title="" id="20" name="Picture"/>
+            <a:graphic>
+              <a:graphicData uri="http://schemas.openxmlformats.org/drawingml/2006/picture">
+                <pic:pic>
+                  <pic:nvPicPr>
+                    <pic:cNvPr descr="image/3.png" id="21" name="Picture"/>
+                    <pic:cNvPicPr>
+                      <a:picLocks noChangeArrowheads="1" noChangeAspect="1"/>
+                    </pic:cNvPicPr>
+                  </pic:nvPicPr>
+                  <pic:blipFill>
+                    <a:blip r:embed="rId19"/>
+                    <a:stretch>
+                      <a:fillRect/>
+                    </a:stretch>
+                  </pic:blipFill>
+                  <pic:spPr bwMode="auto">
+                    <a:xfrm>
+                      <a:off x="0" y="0"/>
+                      <a:ext cx="5334000" cy="1811054"/>
+                    </a:xfrm>
+                    <a:prstGeom prst="rect">
+                      <a:avLst/>
+                    </a:prstGeom>
+                    <a:noFill/>
+                    <a:ln w="9525">
+                      <a:noFill/>
+                      <a:headEnd/>
+                      <a:tailEnd/>
+                    </a:ln>
+                  </pic:spPr>
+                </pic:pic>
+              </a:graphicData>
+            </a:graphic>
+          </wp:inline>
+        </w:drawing>
+      </w:r>
+    </w:p>
+    <w:p>
+      <w:pPr>
+        <w:pStyle w:val="ImageCaption"/>
+      </w:pPr>
+      <w:r>
+        <w:t xml:space="preserve">Вывод mount</w:t>
+      </w:r>
+    </w:p>
+    <w:bookmarkEnd w:id="22"/>
+    <w:bookmarkEnd w:id="23"/>
+    <w:bookmarkStart w:id="24" w:name="выводы"/>
     <w:p>
       <w:pPr>
         <w:pStyle w:val="Heading1"/>
@@ -848,7 +697,7 @@
         <w:pStyle w:val="FirstParagraph"/>
       </w:pPr>
       <w:r>
-        <w:t xml:space="preserve">В ходе выполнения лабораторной работы была успешно установлена операционная система Rocky Linux 9 на виртуальную машину. Были получены навыки работы с установщиком, настройки параметров системы. С помощью команды</w:t>
+        <w:t xml:space="preserve">В ходе выполнения лабораторной работы была успешно установлена операционная система Rocky Linux 10 на виртуальную машину. Были получены навыки работы с установщиком, настройки параметров системы. С помощью команды</w:t>
       </w:r>
       <w:r>
         <w:t xml:space="preserve"> </w:t>
@@ -866,7 +715,7 @@
         <w:t xml:space="preserve">проведен анализ загрузки системы и получена информация об аппаратном обеспечении. Все поставленные задачи были выполнены.</w:t>
       </w:r>
     </w:p>
-    <w:bookmarkEnd w:id="31"/>
+    <w:bookmarkEnd w:id="24"/>
     <w:sectPr>
       <w:footnotePr>
         <w:numRestart w:val="eachSect"/>

</xml_diff>